<commit_message>
docs: plan para abrir la plataforma a internet (aplazado) con opciones, riesgos y decisiones pendientes
</commit_message>
<xml_diff>
--- a/docs/SIGET_Como_abrir_la_plataforma.docx
+++ b/docs/SIGET_Como_abrir_la_plataforma.docx
@@ -408,6 +408,34 @@
       </w:pPr>
       <w:r>
         <w:t xml:space="preserve">http://…:8080 solo redirige a HTTPS.</w:t>
+      </w:r>
+    </w:p>
+    <w:p>
+      <w:pPr>
+        <w:pBdr>
+          <w:left w:val="single" w:color="2E75B6" w:sz="18" w:space="6"/>
+        </w:pBdr>
+        <w:shd w:fill="EEF4FA" w:val="clear"/>
+        <w:spacing w:after="160" w:before="80" w:line="270"/>
+        <w:ind w:left="160" w:right="80"/>
+      </w:pPr>
+      <w:r>
+        <w:rPr>
+          <w:b/>
+          <w:bCs/>
+          <w:color w:val="404040"/>
+          <w:sz w:val="20"/>
+          <w:szCs w:val="20"/>
+        </w:rPr>
+        <w:t xml:space="preserve">¿Abrirla a todo internet?</w:t>
+      </w:r>
+      <w:r>
+        <w:rPr>
+          <w:color w:val="404040"/>
+          <w:sz w:val="20"/>
+          <w:szCs w:val="20"/>
+        </w:rPr>
+        <w:t xml:space="preserve"> Hoy solo se accede por la red de VMware o por Tailscale. El plan para publicarla en un enlace público (con sus riesgos y decisiones pendientes) está en abrir-a-internet.md.</w:t>
       </w:r>
     </w:p>
     <w:p>

</xml_diff>